<commit_message>
fix: pin babel-preset-expo to SDK 54 (57.x left private class fields for Hermes)
</commit_message>
<xml_diff>
--- a/docs/Privacy_Policy_Sequins.docx
+++ b/docs/Privacy_Policy_Sequins.docx
@@ -4,51 +4,64 @@
   <w:body>
     <w:p>
       <w:pPr>
-        <w:pStyle w:val="Title"/>
+        <w:jc w:val="center"/>
       </w:pPr>
       <w:r>
         <w:rPr>
-          <w:color w:val="00B3A4"/>
+          <w:rFonts w:ascii="Arial" w:hAnsi="Arial"/>
+          <w:b/>
+          <w:sz w:val="32"/>
         </w:rPr>
-        <w:t>Sequins - Privacy Policy</w:t>
-      </w:r>
-    </w:p>
-    <w:p>
-      <w:r>
-        <w:rPr>
-          <w:b w:val="0"/>
-          <w:i/>
-          <w:sz w:val="22"/>
-        </w:rPr>
-        <w:t>Effective Date: May 29, 2026  |  Last Updated: May 29, 2026</w:t>
-      </w:r>
-    </w:p>
-    <w:p>
-      <w:r>
-        <w:rPr>
-          <w:b w:val="0"/>
-          <w:i w:val="0"/>
-          <w:sz w:val="22"/>
-        </w:rPr>
-        <w:t>This Privacy Policy explains how Sequins collects, uses, and shares information about you when you use our mobile application. By using Sequins, you agree to the practices described here.</w:t>
+        <w:t>Sequins: Drag Event Finder — Privacy Policy</w:t>
       </w:r>
     </w:p>
     <w:p>
       <w:pPr>
-        <w:pStyle w:val="Heading1"/>
+        <w:spacing w:after="120"/>
       </w:pPr>
       <w:r>
         <w:rPr>
-          <w:color w:val="00B3A4"/>
+          <w:rFonts w:ascii="Arial" w:hAnsi="Arial"/>
+          <w:sz w:val="22"/>
+        </w:rPr>
+        <w:t>Effective Date: July 14, 2026  |  Last Updated: July 14, 2026</w:t>
+      </w:r>
+    </w:p>
+    <w:p>
+      <w:pPr>
+        <w:spacing w:after="120"/>
+      </w:pPr>
+      <w:r>
+        <w:rPr>
+          <w:rFonts w:ascii="Arial" w:hAnsi="Arial"/>
+          <w:sz w:val="22"/>
+        </w:rPr>
+        <w:t>This Privacy Policy explains how The Bradley Project LLC ("Sequins," "we," "us," or "our") collects, uses, and shares information about you when you use the Sequins: Drag Event Finder mobile application. By using Sequins, you agree to the practices described here.</w:t>
+      </w:r>
+    </w:p>
+    <w:p>
+      <w:pPr>
+        <w:spacing w:before="240" w:after="80"/>
+      </w:pPr>
+      <w:r>
+        <w:rPr>
+          <w:rFonts w:ascii="Arial" w:hAnsi="Arial"/>
+          <w:b/>
+          <w:sz w:val="26"/>
         </w:rPr>
         <w:t>1. Information We Collect</w:t>
       </w:r>
     </w:p>
     <w:p>
       <w:pPr>
-        <w:pStyle w:val="Heading2"/>
+        <w:spacing w:before="240" w:after="80"/>
       </w:pPr>
       <w:r>
+        <w:rPr>
+          <w:rFonts w:ascii="Arial" w:hAnsi="Arial"/>
+          <w:b/>
+          <w:sz w:val="22"/>
+        </w:rPr>
         <w:t>1.1 Information You Provide</w:t>
       </w:r>
     </w:p>
@@ -58,9 +71,10 @@
       </w:pPr>
       <w:r>
         <w:rPr>
+          <w:rFonts w:ascii="Arial" w:hAnsi="Arial"/>
           <w:sz w:val="22"/>
         </w:rPr>
-        <w:t>Account information: email address and password</w:t>
+        <w:t>Account information: email address and password.</w:t>
       </w:r>
     </w:p>
     <w:p>
@@ -69,9 +83,10 @@
       </w:pPr>
       <w:r>
         <w:rPr>
+          <w:rFonts w:ascii="Arial" w:hAnsi="Arial"/>
           <w:sz w:val="22"/>
         </w:rPr>
-        <w:t>Profile information: display name, stage name, bio, city, photos, social media links, phone number (talent only - shown only to hosts who book you)</w:t>
+        <w:t>Profile information: display name, stage name, bio, city, photos, social media links, and phone number (Talent only — shown only to Hosts who book you).</w:t>
       </w:r>
     </w:p>
     <w:p>
@@ -80,9 +95,10 @@
       </w:pPr>
       <w:r>
         <w:rPr>
+          <w:rFonts w:ascii="Arial" w:hAnsi="Arial"/>
           <w:sz w:val="22"/>
         </w:rPr>
-        <w:t>Event information: event details, venue, ticketing data, and performer rosters (hosts)</w:t>
+        <w:t>Event information: event details, venue, ticketing data, and performer rosters (Hosts).</w:t>
       </w:r>
     </w:p>
     <w:p>
@@ -91,9 +107,10 @@
       </w:pPr>
       <w:r>
         <w:rPr>
+          <w:rFonts w:ascii="Arial" w:hAnsi="Arial"/>
           <w:sz w:val="22"/>
         </w:rPr>
-        <w:t>Payment information: Venmo handles you choose to display publicly for tips. We do not process payments directly in v1.0; Stripe will be added in a future release.</w:t>
+        <w:t>Payment information: ticket purchases are processed by Stripe, Inc. We do not store your payment card number. Stripe processes payment data under its own Privacy Policy (stripe.com/privacy). Venmo handles you display publicly for tips are stored as plain text in your profile.</w:t>
       </w:r>
     </w:p>
     <w:p>
@@ -102,9 +119,10 @@
       </w:pPr>
       <w:r>
         <w:rPr>
+          <w:rFonts w:ascii="Arial" w:hAnsi="Arial"/>
           <w:sz w:val="22"/>
         </w:rPr>
-        <w:t>Commission details: types of work you offer and pricing notes (talent)</w:t>
+        <w:t>Commission details: types of work you offer and pricing notes (Talent).</w:t>
       </w:r>
     </w:p>
     <w:p>
@@ -113,16 +131,22 @@
       </w:pPr>
       <w:r>
         <w:rPr>
+          <w:rFonts w:ascii="Arial" w:hAnsi="Arial"/>
           <w:sz w:val="22"/>
         </w:rPr>
-        <w:t>Communications: booking requests and messages sent through the App</w:t>
+        <w:t>Communications: booking requests and messages sent through the App.</w:t>
       </w:r>
     </w:p>
     <w:p>
       <w:pPr>
-        <w:pStyle w:val="Heading2"/>
+        <w:spacing w:before="240" w:after="80"/>
       </w:pPr>
       <w:r>
+        <w:rPr>
+          <w:rFonts w:ascii="Arial" w:hAnsi="Arial"/>
+          <w:b/>
+          <w:sz w:val="22"/>
+        </w:rPr>
         <w:t>1.2 Information Collected Automatically</w:t>
       </w:r>
     </w:p>
@@ -132,9 +156,10 @@
       </w:pPr>
       <w:r>
         <w:rPr>
+          <w:rFonts w:ascii="Arial" w:hAnsi="Arial"/>
           <w:sz w:val="22"/>
         </w:rPr>
-        <w:t>Device information: device type, operating system, and app version</w:t>
+        <w:t>Device information: device type, operating system, and app version.</w:t>
       </w:r>
     </w:p>
     <w:p>
@@ -143,9 +168,10 @@
       </w:pPr>
       <w:r>
         <w:rPr>
+          <w:rFonts w:ascii="Arial" w:hAnsi="Arial"/>
           <w:sz w:val="22"/>
         </w:rPr>
-        <w:t>Usage data: screens viewed, features used, and interactions within the App</w:t>
+        <w:t>Usage data: screens viewed, features used, and interactions within the App.</w:t>
       </w:r>
     </w:p>
     <w:p>
@@ -154,16 +180,34 @@
       </w:pPr>
       <w:r>
         <w:rPr>
+          <w:rFonts w:ascii="Arial" w:hAnsi="Arial"/>
           <w:sz w:val="22"/>
         </w:rPr>
-        <w:t>Authentication tokens: stored securely using platform secure storage (iOS Keychain / Android Keystore)</w:t>
+        <w:t>Push notification tokens: stored to deliver event and booking alerts to your device.</w:t>
       </w:r>
     </w:p>
     <w:p>
       <w:pPr>
-        <w:pStyle w:val="Heading2"/>
+        <w:pStyle w:val="ListBullet"/>
       </w:pPr>
       <w:r>
+        <w:rPr>
+          <w:rFonts w:ascii="Arial" w:hAnsi="Arial"/>
+          <w:sz w:val="22"/>
+        </w:rPr>
+        <w:t>Authentication tokens: stored securely using platform secure storage (iOS Keychain / Android Keystore).</w:t>
+      </w:r>
+    </w:p>
+    <w:p>
+      <w:pPr>
+        <w:spacing w:before="240" w:after="80"/>
+      </w:pPr>
+      <w:r>
+        <w:rPr>
+          <w:rFonts w:ascii="Arial" w:hAnsi="Arial"/>
+          <w:b/>
+          <w:sz w:val="22"/>
+        </w:rPr>
         <w:t>1.3 Information We Do NOT Collect</w:t>
       </w:r>
     </w:p>
@@ -173,9 +217,10 @@
       </w:pPr>
       <w:r>
         <w:rPr>
+          <w:rFonts w:ascii="Arial" w:hAnsi="Arial"/>
           <w:sz w:val="22"/>
         </w:rPr>
-        <w:t>We do not serve advertisements and do not collect data for advertising purposes</w:t>
+        <w:t>We do not serve advertisements and do not collect data for advertising purposes.</w:t>
       </w:r>
     </w:p>
     <w:p>
@@ -184,9 +229,10 @@
       </w:pPr>
       <w:r>
         <w:rPr>
+          <w:rFonts w:ascii="Arial" w:hAnsi="Arial"/>
           <w:sz w:val="22"/>
         </w:rPr>
-        <w:t>We do not sell your personal information to third parties</w:t>
+        <w:t>We do not sell your personal information to third parties.</w:t>
       </w:r>
     </w:p>
     <w:p>
@@ -195,18 +241,33 @@
       </w:pPr>
       <w:r>
         <w:rPr>
+          <w:rFonts w:ascii="Arial" w:hAnsi="Arial"/>
           <w:sz w:val="22"/>
         </w:rPr>
-        <w:t>We do not use tracking pixels or cross-app tracking</w:t>
+        <w:t>We do not use tracking pixels or cross-app tracking.</w:t>
       </w:r>
     </w:p>
     <w:p>
       <w:pPr>
-        <w:pStyle w:val="Heading1"/>
+        <w:pStyle w:val="ListBullet"/>
       </w:pPr>
       <w:r>
         <w:rPr>
-          <w:color w:val="00B3A4"/>
+          <w:rFonts w:ascii="Arial" w:hAnsi="Arial"/>
+          <w:sz w:val="22"/>
+        </w:rPr>
+        <w:t>We do not collect precise geolocation data.</w:t>
+      </w:r>
+    </w:p>
+    <w:p>
+      <w:pPr>
+        <w:spacing w:before="240" w:after="80"/>
+      </w:pPr>
+      <w:r>
+        <w:rPr>
+          <w:rFonts w:ascii="Arial" w:hAnsi="Arial"/>
+          <w:b/>
+          <w:sz w:val="26"/>
         </w:rPr>
         <w:t>2. How We Use Your Information</w:t>
       </w:r>
@@ -217,9 +278,10 @@
       </w:pPr>
       <w:r>
         <w:rPr>
+          <w:rFonts w:ascii="Arial" w:hAnsi="Arial"/>
           <w:sz w:val="22"/>
         </w:rPr>
-        <w:t>To provide and operate the App, including account management, event discovery, ticketing, and booking</w:t>
+        <w:t>To provide and operate the App, including account management, event discovery, ticketing, and booking.</w:t>
       </w:r>
     </w:p>
     <w:p>
@@ -228,9 +290,10 @@
       </w:pPr>
       <w:r>
         <w:rPr>
+          <w:rFonts w:ascii="Arial" w:hAnsi="Arial"/>
           <w:sz w:val="22"/>
         </w:rPr>
-        <w:t>To display your public performer or host profile to other users</w:t>
+        <w:t>To display your public performer or host profile to other users.</w:t>
       </w:r>
     </w:p>
     <w:p>
@@ -239,9 +302,10 @@
       </w:pPr>
       <w:r>
         <w:rPr>
+          <w:rFonts w:ascii="Arial" w:hAnsi="Arial"/>
           <w:sz w:val="22"/>
         </w:rPr>
-        <w:t>To send in-app notifications about bookings, tickets, and event updates</w:t>
+        <w:t>To send push notifications about bookings, tickets, and event updates.</w:t>
       </w:r>
     </w:p>
     <w:p>
@@ -250,9 +314,10 @@
       </w:pPr>
       <w:r>
         <w:rPr>
+          <w:rFonts w:ascii="Arial" w:hAnsi="Arial"/>
           <w:sz w:val="22"/>
         </w:rPr>
-        <w:t>To improve and debug the App</w:t>
+        <w:t>To process ticket purchases through Stripe.</w:t>
       </w:r>
     </w:p>
     <w:p>
@@ -261,27 +326,44 @@
       </w:pPr>
       <w:r>
         <w:rPr>
+          <w:rFonts w:ascii="Arial" w:hAnsi="Arial"/>
           <w:sz w:val="22"/>
         </w:rPr>
-        <w:t>To comply with legal obligations</w:t>
+        <w:t>To improve and debug the App.</w:t>
       </w:r>
     </w:p>
     <w:p>
       <w:pPr>
-        <w:pStyle w:val="Heading1"/>
+        <w:pStyle w:val="ListBullet"/>
       </w:pPr>
       <w:r>
         <w:rPr>
-          <w:color w:val="00B3A4"/>
+          <w:rFonts w:ascii="Arial" w:hAnsi="Arial"/>
+          <w:sz w:val="22"/>
+        </w:rPr>
+        <w:t>To comply with legal obligations.</w:t>
+      </w:r>
+    </w:p>
+    <w:p>
+      <w:pPr>
+        <w:spacing w:before="240" w:after="80"/>
+      </w:pPr>
+      <w:r>
+        <w:rPr>
+          <w:rFonts w:ascii="Arial" w:hAnsi="Arial"/>
+          <w:b/>
+          <w:sz w:val="26"/>
         </w:rPr>
         <w:t>3. How We Share Your Information</w:t>
       </w:r>
     </w:p>
     <w:p>
+      <w:pPr>
+        <w:spacing w:after="120"/>
+      </w:pPr>
       <w:r>
         <w:rPr>
-          <w:b w:val="0"/>
-          <w:i w:val="0"/>
+          <w:rFonts w:ascii="Arial" w:hAnsi="Arial"/>
           <w:sz w:val="22"/>
         </w:rPr>
         <w:t>We do not sell your information. We share it only in these limited circumstances:</w:t>
@@ -293,9 +375,10 @@
       </w:pPr>
       <w:r>
         <w:rPr>
+          <w:rFonts w:ascii="Arial" w:hAnsi="Arial"/>
           <w:sz w:val="22"/>
         </w:rPr>
-        <w:t>With other users: public profile information is visible to all App users. Your phone number is shown only to hosts who have booked you.</w:t>
+        <w:t>With other users: public profile information is visible to all App users. Your phone number is shown only to Hosts who have booked you.</w:t>
       </w:r>
     </w:p>
     <w:p>
@@ -304,9 +387,10 @@
       </w:pPr>
       <w:r>
         <w:rPr>
+          <w:rFonts w:ascii="Arial" w:hAnsi="Arial"/>
           <w:sz w:val="22"/>
         </w:rPr>
-        <w:t>With service providers: we use Supabase (supabase.com) as our backend. Supabase processes data under their own privacy and security policies.</w:t>
+        <w:t>With Supabase: we use Supabase (supabase.com) as our backend database provider. Supabase processes data on our behalf, hosted on AWS (us-west-2).</w:t>
       </w:r>
     </w:p>
     <w:p>
@@ -315,39 +399,58 @@
       </w:pPr>
       <w:r>
         <w:rPr>
+          <w:rFonts w:ascii="Arial" w:hAnsi="Arial"/>
           <w:sz w:val="22"/>
         </w:rPr>
-        <w:t>For legal reasons: if required by law or court order, or to protect the safety of our users.</w:t>
+        <w:t>With Stripe: ticket payment data is transmitted to and processed by Stripe, Inc. under their Privacy Policy (stripe.com/privacy).</w:t>
       </w:r>
     </w:p>
     <w:p>
       <w:pPr>
-        <w:pStyle w:val="Heading1"/>
+        <w:pStyle w:val="ListBullet"/>
       </w:pPr>
       <w:r>
         <w:rPr>
-          <w:color w:val="00B3A4"/>
+          <w:rFonts w:ascii="Arial" w:hAnsi="Arial"/>
+          <w:sz w:val="22"/>
+        </w:rPr>
+        <w:t>For legal reasons: if required by law, court order, or to protect the safety of our users or the public.</w:t>
+      </w:r>
+    </w:p>
+    <w:p>
+      <w:pPr>
+        <w:spacing w:before="240" w:after="80"/>
+      </w:pPr>
+      <w:r>
+        <w:rPr>
+          <w:rFonts w:ascii="Arial" w:hAnsi="Arial"/>
+          <w:b/>
+          <w:sz w:val="26"/>
         </w:rPr>
         <w:t>4. Data Storage and Security</w:t>
       </w:r>
     </w:p>
     <w:p>
+      <w:pPr>
+        <w:spacing w:after="120"/>
+      </w:pPr>
       <w:r>
         <w:rPr>
-          <w:b w:val="0"/>
-          <w:i w:val="0"/>
+          <w:rFonts w:ascii="Arial" w:hAnsi="Arial"/>
           <w:sz w:val="22"/>
         </w:rPr>
-        <w:t>Your data is stored in Supabase's cloud infrastructure on AWS (us-west-2). We use row-level security to ensure users can only access data they are authorized to see. Authentication tokens are stored in your device's secure storage.</w:t>
+        <w:t>Your data is stored in Supabase's cloud infrastructure on AWS (us-west-2). We use row-level security to ensure users can only access data they are authorized to see. Authentication tokens are stored in your device's secure storage. We use industry-standard practices to protect your information, but no method of transmission or storage is 100% secure.</w:t>
       </w:r>
     </w:p>
     <w:p>
       <w:pPr>
-        <w:pStyle w:val="Heading1"/>
+        <w:spacing w:before="240" w:after="80"/>
       </w:pPr>
       <w:r>
         <w:rPr>
-          <w:color w:val="00B3A4"/>
+          <w:rFonts w:ascii="Arial" w:hAnsi="Arial"/>
+          <w:b/>
+          <w:sz w:val="26"/>
         </w:rPr>
         <w:t>5. Your Rights and Choices</w:t>
       </w:r>
@@ -358,9 +461,10 @@
       </w:pPr>
       <w:r>
         <w:rPr>
+          <w:rFonts w:ascii="Arial" w:hAnsi="Arial"/>
           <w:sz w:val="22"/>
         </w:rPr>
-        <w:t>Access and correction: you can view and edit your profile at any time from the App</w:t>
+        <w:t>Access and correction: you can view and edit your profile at any time from the App.</w:t>
       </w:r>
     </w:p>
     <w:p>
@@ -369,9 +473,10 @@
       </w:pPr>
       <w:r>
         <w:rPr>
+          <w:rFonts w:ascii="Arial" w:hAnsi="Arial"/>
           <w:sz w:val="22"/>
         </w:rPr>
-        <w:t>Account deletion: permanently delete your account and all data from Profile &gt; Delete Account. Immediate and irreversible.</w:t>
+        <w:t>Account deletion: permanently delete your account and all associated data via Profile &gt; Delete Account. This action is immediate and irreversible.</w:t>
       </w:r>
     </w:p>
     <w:p>
@@ -380,9 +485,10 @@
       </w:pPr>
       <w:r>
         <w:rPr>
+          <w:rFonts w:ascii="Arial" w:hAnsi="Arial"/>
           <w:sz w:val="22"/>
         </w:rPr>
-        <w:t>Data export: contact us to request a copy of your data</w:t>
+        <w:t>Data export: contact us at privacy@sequins.app to request a copy of your data.</w:t>
       </w:r>
     </w:p>
     <w:p>
@@ -391,9 +497,10 @@
       </w:pPr>
       <w:r>
         <w:rPr>
+          <w:rFonts w:ascii="Arial" w:hAnsi="Arial"/>
           <w:sz w:val="22"/>
         </w:rPr>
-        <w:t>California residents (CCPA): right to know, delete, and opt out of sale (we do not sell data)</w:t>
+        <w:t>Push notifications: you may disable push notifications at any time from your device settings.</w:t>
       </w:r>
     </w:p>
     <w:p>
@@ -402,105 +509,149 @@
       </w:pPr>
       <w:r>
         <w:rPr>
+          <w:rFonts w:ascii="Arial" w:hAnsi="Arial"/>
           <w:sz w:val="22"/>
         </w:rPr>
-        <w:t>EU/UK residents (GDPR): right to access, rectify, erase, and port your data</w:t>
+        <w:t>California residents (CCPA): you have the right to know, delete, and opt out of sale of personal information. We do not sell your data.</w:t>
       </w:r>
     </w:p>
     <w:p>
       <w:pPr>
-        <w:pStyle w:val="Heading1"/>
+        <w:pStyle w:val="ListBullet"/>
       </w:pPr>
       <w:r>
         <w:rPr>
-          <w:color w:val="00B3A4"/>
+          <w:rFonts w:ascii="Arial" w:hAnsi="Arial"/>
+          <w:sz w:val="22"/>
+        </w:rPr>
+        <w:t>EU/UK residents (GDPR): you have the right to access, rectify, erase, restrict processing, and port your data. Contact us at privacy@sequins.app to exercise these rights.</w:t>
+      </w:r>
+    </w:p>
+    <w:p>
+      <w:pPr>
+        <w:spacing w:before="240" w:after="80"/>
+      </w:pPr>
+      <w:r>
+        <w:rPr>
+          <w:rFonts w:ascii="Arial" w:hAnsi="Arial"/>
+          <w:b/>
+          <w:sz w:val="26"/>
         </w:rPr>
         <w:t>6. Children's Privacy</w:t>
       </w:r>
     </w:p>
     <w:p>
+      <w:pPr>
+        <w:spacing w:after="120"/>
+      </w:pPr>
       <w:r>
         <w:rPr>
-          <w:b w:val="0"/>
-          <w:i w:val="0"/>
+          <w:rFonts w:ascii="Arial" w:hAnsi="Arial"/>
           <w:sz w:val="22"/>
         </w:rPr>
-        <w:t>Sequins is intended for users 17 years of age and older. We do not knowingly collect information from anyone under 13. If you believe a minor has provided us with personal information, please contact us immediately.</w:t>
+        <w:t>Sequins is intended for users 17 years of age and older. We do not knowingly collect personal information from anyone under 13 years of age. If you believe a child under 13 has provided us with personal information, please contact us immediately at privacy@sequins.app and we will promptly delete it.</w:t>
       </w:r>
     </w:p>
     <w:p>
       <w:pPr>
-        <w:pStyle w:val="Heading1"/>
+        <w:spacing w:before="240" w:after="80"/>
       </w:pPr>
       <w:r>
         <w:rPr>
-          <w:color w:val="00B3A4"/>
+          <w:rFonts w:ascii="Arial" w:hAnsi="Arial"/>
+          <w:b/>
+          <w:sz w:val="26"/>
         </w:rPr>
-        <w:t>7. Third-Party Links</w:t>
-      </w:r>
-    </w:p>
-    <w:p>
-      <w:r>
-        <w:rPr>
-          <w:b w:val="0"/>
-          <w:i w:val="0"/>
-          <w:sz w:val="22"/>
-        </w:rPr>
-        <w:t>The App may display links to Instagram, TikTok, Venmo, and other third-party services via performer profiles. We are not responsible for those services' privacy practices.</w:t>
+        <w:t>7. Third-Party Links and Services</w:t>
       </w:r>
     </w:p>
     <w:p>
       <w:pPr>
-        <w:pStyle w:val="Heading1"/>
+        <w:spacing w:after="120"/>
       </w:pPr>
       <w:r>
         <w:rPr>
-          <w:color w:val="00B3A4"/>
-        </w:rPr>
-        <w:t>8. Changes to This Policy</w:t>
-      </w:r>
-    </w:p>
-    <w:p>
-      <w:r>
-        <w:rPr>
-          <w:b w:val="0"/>
-          <w:i w:val="0"/>
+          <w:rFonts w:ascii="Arial" w:hAnsi="Arial"/>
           <w:sz w:val="22"/>
         </w:rPr>
-        <w:t>We may update this Privacy Policy from time to time. We will notify you of material changes by updating the "Last Updated" date above and, where appropriate, by an in-app notice.</w:t>
+        <w:t>The App may display links to Instagram, TikTok, Venmo, and other third-party services via performer profiles. We are not responsible for those services' privacy practices. We encourage you to review their privacy policies before interacting with them.</w:t>
       </w:r>
     </w:p>
     <w:p>
       <w:pPr>
-        <w:pStyle w:val="Heading1"/>
+        <w:spacing w:before="240" w:after="80"/>
       </w:pPr>
       <w:r>
         <w:rPr>
-          <w:color w:val="00B3A4"/>
+          <w:rFonts w:ascii="Arial" w:hAnsi="Arial"/>
+          <w:b/>
+          <w:sz w:val="26"/>
         </w:rPr>
-        <w:t>9. Contact Us</w:t>
+        <w:t>8. Data Retention</w:t>
       </w:r>
     </w:p>
     <w:p>
+      <w:pPr>
+        <w:spacing w:after="120"/>
+      </w:pPr>
       <w:r>
         <w:rPr>
-          <w:b w:val="0"/>
-          <w:i w:val="0"/>
+          <w:rFonts w:ascii="Arial" w:hAnsi="Arial"/>
           <w:sz w:val="22"/>
         </w:rPr>
-        <w:t>Questions about this Privacy Policy:</w:t>
+        <w:t>We retain your account information for as long as your account is active. When you delete your account, we delete or anonymize your personal information within 30 days, except where retention is required by law or for legitimate business purposes such as fraud prevention.</w:t>
       </w:r>
     </w:p>
     <w:p>
+      <w:pPr>
+        <w:spacing w:before="240" w:after="80"/>
+      </w:pPr>
       <w:r>
         <w:rPr>
-          <w:b w:val="0"/>
-          <w:i w:val="0"/>
+          <w:rFonts w:ascii="Arial" w:hAnsi="Arial"/>
+          <w:b/>
+          <w:sz w:val="26"/>
+        </w:rPr>
+        <w:t>9. Changes to This Policy</w:t>
+      </w:r>
+    </w:p>
+    <w:p>
+      <w:pPr>
+        <w:spacing w:after="120"/>
+      </w:pPr>
+      <w:r>
+        <w:rPr>
+          <w:rFonts w:ascii="Arial" w:hAnsi="Arial"/>
           <w:sz w:val="22"/>
         </w:rPr>
-        <w:t>Sequins</w:t>
+        <w:t>We may update this Privacy Policy from time to time. We will notify you of material changes by updating the "Last Updated" date above and, where appropriate, by an in-app notice or email. Continued use of the App after changes constitutes acceptance.</w:t>
+      </w:r>
+    </w:p>
+    <w:p>
+      <w:pPr>
+        <w:spacing w:before="240" w:after="80"/>
+      </w:pPr>
+      <w:r>
+        <w:rPr>
+          <w:rFonts w:ascii="Arial" w:hAnsi="Arial"/>
+          <w:b/>
+          <w:sz w:val="26"/>
+        </w:rPr>
+        <w:t>10. Contact Us</w:t>
+      </w:r>
+    </w:p>
+    <w:p>
+      <w:pPr>
+        <w:spacing w:after="120"/>
+      </w:pPr>
+      <w:r>
+        <w:rPr>
+          <w:rFonts w:ascii="Arial" w:hAnsi="Arial"/>
+          <w:sz w:val="22"/>
+        </w:rPr>
+        <w:t>Sequins / The Bradley Project LLC</w:t>
         <w:br/>
-        <w:t>Email: privacy@sequins.app  (update before submission)</w:t>
+        <w:t>Email: privacy@sequins.app</w:t>
         <w:br/>
         <w:t>Website: https://sequins.app</w:t>
       </w:r>

</xml_diff>